<commit_message>
Update on 2026-05-26 19:45:37, from DESKTOP-R2D2
</commit_message>
<xml_diff>
--- a/documents/resumes/carlos-mercado-resume-software-developer-ENG.docx
+++ b/documents/resumes/carlos-mercado-resume-software-developer-ENG.docx
@@ -33,12 +33,16 @@
         <w:rPr>
           <w:sz w:val="22"/>
           <w:szCs w:val="22"/>
+          <w:lang w:val="es-AR"/>
         </w:rPr>
       </w:pPr>
       <w:r>
         <w:fldChar w:fldCharType="begin"/>
       </w:r>
       <w:r>
+        <w:rPr>
+          <w:lang w:val="es-AR"/>
+        </w:rPr>
         <w:instrText>HYPERLINK "https://api.whatsapp.com/send/?phone=5492942415110&amp;text&amp;app_absent=0"</w:instrText>
       </w:r>
       <w:r>
@@ -49,6 +53,7 @@
           <w:rStyle w:val="Hyperlink"/>
           <w:sz w:val="22"/>
           <w:szCs w:val="22"/>
+          <w:lang w:val="es-AR"/>
         </w:rPr>
         <w:t>+54 9 2942</w:t>
       </w:r>
@@ -57,6 +62,7 @@
           <w:rStyle w:val="Hyperlink"/>
           <w:sz w:val="22"/>
           <w:szCs w:val="22"/>
+          <w:lang w:val="es-AR"/>
         </w:rPr>
         <w:t xml:space="preserve"> 415110</w:t>
       </w:r>
@@ -64,35 +70,18 @@
         <w:fldChar w:fldCharType="end"/>
       </w:r>
       <w:r>
+        <w:rPr>
+          <w:lang w:val="es-AR"/>
+        </w:rPr>
         <w:t xml:space="preserve"> </w:t>
       </w:r>
       <w:r>
         <w:rPr>
           <w:sz w:val="22"/>
           <w:szCs w:val="22"/>
-        </w:rPr>
-        <w:t> </w:t>
-      </w:r>
-      <w:r>
-        <w:rPr>
-          <w:sz w:val="22"/>
-          <w:szCs w:val="22"/>
-        </w:rPr>
-        <w:t xml:space="preserve"> </w:t>
-      </w:r>
-      <w:r>
-        <w:rPr>
-          <w:sz w:val="22"/>
-          <w:szCs w:val="22"/>
+          <w:lang w:val="es-AR"/>
         </w:rPr>
         <w:t>|</w:t>
-      </w:r>
-      <w:r>
-        <w:rPr>
-          <w:sz w:val="22"/>
-          <w:szCs w:val="22"/>
-        </w:rPr>
-        <w:t xml:space="preserve">  </w:t>
       </w:r>
       <w:r>
         <w:rPr>
@@ -100,6 +89,7 @@
           <w:color w:val="000000"/>
           <w:sz w:val="22"/>
           <w:szCs w:val="22"/>
+          <w:lang w:val="es-AR"/>
         </w:rPr>
         <w:t xml:space="preserve"> </w:t>
       </w:r>
@@ -109,6 +99,7 @@
             <w:rStyle w:val="Hyperlink"/>
             <w:sz w:val="22"/>
             <w:szCs w:val="22"/>
+            <w:lang w:val="es-AR"/>
           </w:rPr>
           <w:t>carlos.washington.mercado@gmail.com</w:t>
         </w:r>
@@ -117,6 +108,7 @@
         <w:rPr>
           <w:sz w:val="22"/>
           <w:szCs w:val="22"/>
+          <w:lang w:val="es-AR"/>
         </w:rPr>
         <w:t xml:space="preserve"> </w:t>
       </w:r>
@@ -124,29 +116,9 @@
         <w:rPr>
           <w:sz w:val="22"/>
           <w:szCs w:val="22"/>
-        </w:rPr>
-        <w:t xml:space="preserve">  </w:t>
-      </w:r>
-      <w:r>
-        <w:rPr>
-          <w:sz w:val="22"/>
-          <w:szCs w:val="22"/>
-        </w:rPr>
-        <w:t>|</w:t>
-      </w:r>
-      <w:r>
-        <w:rPr>
-          <w:sz w:val="22"/>
-          <w:szCs w:val="22"/>
-        </w:rPr>
-        <w:t xml:space="preserve">  </w:t>
-      </w:r>
-      <w:r>
-        <w:rPr>
-          <w:sz w:val="22"/>
-          <w:szCs w:val="22"/>
-        </w:rPr>
-        <w:t xml:space="preserve"> </w:t>
+          <w:lang w:val="es-AR"/>
+        </w:rPr>
+        <w:t xml:space="preserve">| </w:t>
       </w:r>
       <w:hyperlink r:id="rId9" w:history="1">
         <w:r>
@@ -154,6 +126,7 @@
             <w:rStyle w:val="Hyperlink"/>
             <w:sz w:val="22"/>
             <w:szCs w:val="22"/>
+            <w:lang w:val="es-AR"/>
           </w:rPr>
           <w:t>linkedin.com/in/carlos</w:t>
         </w:r>
@@ -162,6 +135,7 @@
             <w:rStyle w:val="Hyperlink"/>
             <w:sz w:val="22"/>
             <w:szCs w:val="22"/>
+            <w:lang w:val="es-AR"/>
           </w:rPr>
           <w:t>-</w:t>
         </w:r>
@@ -170,6 +144,7 @@
             <w:rStyle w:val="Hyperlink"/>
             <w:sz w:val="22"/>
             <w:szCs w:val="22"/>
+            <w:lang w:val="es-AR"/>
           </w:rPr>
           <w:t>w</w:t>
         </w:r>
@@ -178,6 +153,7 @@
             <w:rStyle w:val="Hyperlink"/>
             <w:sz w:val="22"/>
             <w:szCs w:val="22"/>
+            <w:lang w:val="es-AR"/>
           </w:rPr>
           <w:t>ashington-</w:t>
         </w:r>
@@ -186,6 +162,7 @@
             <w:rStyle w:val="Hyperlink"/>
             <w:sz w:val="22"/>
             <w:szCs w:val="22"/>
+            <w:lang w:val="es-AR"/>
           </w:rPr>
           <w:t>m</w:t>
         </w:r>
@@ -194,6 +171,7 @@
             <w:rStyle w:val="Hyperlink"/>
             <w:sz w:val="22"/>
             <w:szCs w:val="22"/>
+            <w:lang w:val="es-AR"/>
           </w:rPr>
           <w:t>ercado</w:t>
         </w:r>
@@ -598,7 +576,27 @@
                   <w:sz w:val="21"/>
                   <w:szCs w:val="21"/>
                 </w:rPr>
-                <w:t>LINK</w:t>
+                <w:t>LI</w:t>
+              </w:r>
+              <w:r>
+                <w:rPr>
+                  <w:rStyle w:val="Hyperlink"/>
+                  <w:i/>
+                  <w:iCs/>
+                  <w:sz w:val="21"/>
+                  <w:szCs w:val="21"/>
+                </w:rPr>
+                <w:t>N</w:t>
+              </w:r>
+              <w:r>
+                <w:rPr>
+                  <w:rStyle w:val="Hyperlink"/>
+                  <w:i/>
+                  <w:iCs/>
+                  <w:sz w:val="21"/>
+                  <w:szCs w:val="21"/>
+                </w:rPr>
+                <w:t>K</w:t>
               </w:r>
             </w:hyperlink>
           </w:p>

</xml_diff>